<commit_message>
Regenera .docx/.png de 02, 03 y del panel reconstruido: CSV idénticos a HEAD, solo metadata de regeneración (mismo criterio que cf2e777)
Co-Authored-By: Claude Sonnet 5 <noreply@anthropic.com>
</commit_message>
<xml_diff>
--- a/4. RESULTADOS/Primer_eslabon/00_compendio_tablas.docx
+++ b/4. RESULTADOS/Primer_eslabon/00_compendio_tablas.docx
@@ -9811,7 +9811,7 @@
         <w:pStyle w:val="Titre2"/>
       </w:pPr>
       <w:r>
-        <w:t xml:space="preserve">Tabla 4. Primer eslabón en el año del choque y en un período sin choque</w:t>
+        <w:t xml:space="preserve">Tabla 4. Primer eslabón en el año del choque y en el placebo 2018-2019 (placebo no informativo, ver nota en el script)</w:t>
       </w:r>
     </w:p>
     <w:p>
@@ -9829,7 +9829,7 @@
         <w:ind w:left="60" w:right="60" w:firstLine="0" w:firstLineChars="0"/>
       </w:pPr>
       <w:r>
-        <w:t xml:space="preserve">Tabla 4. Primer eslabón en el año del choque y en un período sin choque</w:t>
+        <w:t xml:space="preserve">Tabla 4. Primer eslabón en el año del choque y en el placebo 2018-2019 (placebo no informativo, ver nota en el script)</w:t>
       </w:r>
     </w:p>
     <w:tbl xmlns:a="http://schemas.openxmlformats.org/drawingml/2006/main" xmlns:pic="http://schemas.openxmlformats.org/drawingml/2006/picture">

</xml_diff>